<commit_message>
Deploy preview for PR 99 🛫
</commit_message>
<xml_diff>
--- a/pr-preview/pr-99/chapters/12-ip-weighting-marginal-structural-models-tracked-changes.docx
+++ b/pr-preview/pr-99/chapters/12-ip-weighting-marginal-structural-models-tracked-changes.docx
@@ -1831,6 +1831,9 @@
             <w:pPr>
               <w:pStyle w:val="BodyText"/>
             </w:pPr>
+            <w:pPr>
+              <w:spacing w:before="16"/>
+            </w:pPr>
             <w:r>
               <w:t xml:space="preserve">The smoking cessation example is convenient (no deep subject-matter knowledge required, public data) but carries a potential</w:t>
             </w:r>
@@ -1943,6 +1946,9 @@
           <w:p>
             <w:pPr>
               <w:pStyle w:val="FirstParagraph"/>
+            </w:pPr>
+            <w:pPr>
+              <w:spacing w:after="16"/>
             </w:pPr>
             <w:r>
               <w:t xml:space="preserve">A randomized trial would not have this problem, because treatment would be assigned at baseline and known even for people who did not reach the 1982 visit.</w:t>
@@ -15166,16 +15172,6 @@
         </w:tc>
       </w:tr>
     </w:tbl>
-    <w:p>
-      <w:pPr>
-        <w:pStyle w:val="FirstParagraph"/>
-      </w:pPr>
-      <w:ins w:id="102" w:author="PR Preview" w:date="2024-01-01T00:00:00Z">
-        <w:r>
-          <w:t xml:space="preserve"> </w:t>
-        </w:r>
-      </w:ins>
-    </w:p>
     <w:tbl>
       <w:tblPr>
         <w:tblStyle w:val="Table"/>
@@ -15206,7 +15202,7 @@
           </w:tcPr>
           <w:p>
             <w:pPr>
-              <w:pStyle w:val="BodyText"/>
+              <w:pStyle w:val="FirstParagraph"/>
             </w:pPr>
             <w:pPr>
               <w:spacing w:before="0" w:after="0"/>
@@ -15280,6 +15276,9 @@
           <w:p>
             <w:pPr>
               <w:pStyle w:val="BodyText"/>
+            </w:pPr>
+            <w:pPr>
+              <w:spacing w:before="16" w:after="16"/>
             </w:pPr>
             <w:r>
               <w:t xml:space="preserve">IP weighting for continuous treatments is often dangerous: the estimates can change a great deal with the choice of model or algorithm for the conditional density</w:t>
@@ -15849,16 +15848,6 @@
         </w:tc>
       </w:tr>
     </w:tbl>
-    <w:p>
-      <w:pPr>
-        <w:pStyle w:val="BodyText"/>
-      </w:pPr>
-      <w:ins w:id="104" w:author="PR Preview" w:date="2024-01-01T00:00:00Z">
-        <w:r>
-          <w:t xml:space="preserve"> </w:t>
-        </w:r>
-      </w:ins>
-    </w:p>
     <w:tbl>
       <w:tblPr>
         <w:tblStyle w:val="Table"/>
@@ -15964,6 +15953,9 @@
             <w:pPr>
               <w:pStyle w:val="BodyText"/>
             </w:pPr>
+            <w:pPr>
+              <w:spacing w:before="16" w:after="16"/>
+            </w:pPr>
             <w:r>
               <w:t xml:space="preserve">The book reports these quantities from the unrounded coefficients.</w:t>
             </w:r>
@@ -16269,7 +16261,7 @@
       <w:pPr>
         <w:pStyle w:val="Heading3"/>
       </w:pPr>
-      <w:ins w:id="106" w:author="PR Preview" w:date="2024-01-01T00:00:00Z">
+      <w:ins w:id="104" w:author="PR Preview" w:date="2024-01-01T00:00:00Z">
         <w:r>
           <w:t xml:space="preserve">4.4 Dichotomous Outcome: Marginal Structural Logistic Model</w:t>
         </w:r>
@@ -16662,7 +16654,7 @@
       <w:pPr>
         <w:pStyle w:val="BodyText"/>
       </w:pPr>
-      <w:ins w:id="107" w:author="PR Preview" w:date="2024-01-01T00:00:00Z">
+      <w:ins w:id="105" w:author="PR Preview" w:date="2024-01-01T00:00:00Z">
         <w:r>
           <w:t xml:space="preserve"> </w:t>
         </w:r>
@@ -17970,7 +17962,7 @@
       <w:pPr>
         <w:pStyle w:val="FirstParagraph"/>
       </w:pPr>
-      <w:ins w:id="1116" w:author="PR Preview" w:date="2024-01-01T00:00:00Z">
+      <w:ins w:id="1114" w:author="PR Preview" w:date="2024-01-01T00:00:00Z">
         <w:r>
           <w:rPr>
             <w:b/>
@@ -17979,12 +17971,12 @@
           <w:t xml:space="preserve">Algorithm 4 (Fitting a Marginal Structural Model with an Effect Modifier)</w:t>
         </w:r>
       </w:ins>
-      <w:ins w:id="1116" w:author="PR Preview" w:date="2024-01-01T00:00:00Z">
+      <w:ins w:id="1114" w:author="PR Preview" w:date="2024-01-01T00:00:00Z">
         <w:r>
           <w:t xml:space="preserve"> </w:t>
         </w:r>
       </w:ins>
-      <w:ins w:id="1116" w:author="PR Preview" w:date="2024-01-01T00:00:00Z">
+      <w:ins w:id="1114" w:author="PR Preview" w:date="2024-01-01T00:00:00Z">
         <w:r>
           <w:t xml:space="preserve"> </w:t>
         </w:r>
@@ -18246,12 +18238,12 @@
           <w:numId w:val="1023"/>
         </w:numPr>
       </w:pPr>
-      <w:ins w:id="119" w:author="PR Preview" w:date="2024-01-01T00:00:00Z">
+      <w:ins w:id="117" w:author="PR Preview" w:date="2024-01-01T00:00:00Z">
         <w:r>
           <w:t xml:space="preserve">Because the model is within levels of</w:t>
         </w:r>
       </w:ins>
-      <w:ins w:id="119" w:author="PR Preview" w:date="2024-01-01T00:00:00Z">
+      <w:ins w:id="117" w:author="PR Preview" w:date="2024-01-01T00:00:00Z">
         <w:r>
           <w:t xml:space="preserve"> </w:t>
         </w:r>
@@ -18261,12 +18253,12 @@
           <m:t>V</m:t>
         </m:r>
       </m:oMath>
-      <w:ins w:id="119" w:author="PR Preview" w:date="2024-01-01T00:00:00Z">
+      <w:ins w:id="117" w:author="PR Preview" w:date="2024-01-01T00:00:00Z">
         <w:r>
           <w:t xml:space="preserve">, the numerator can be</w:t>
         </w:r>
       </w:ins>
-      <w:ins w:id="119" w:author="PR Preview" w:date="2024-01-01T00:00:00Z">
+      <w:ins w:id="117" w:author="PR Preview" w:date="2024-01-01T00:00:00Z">
         <w:r>
           <w:t xml:space="preserve"> </w:t>
         </w:r>
@@ -18300,7 +18292,7 @@
           <m:t>]</m:t>
         </m:r>
       </m:oMath>
-      <w:ins w:id="119" w:author="PR Preview" w:date="2024-01-01T00:00:00Z">
+      <w:ins w:id="117" w:author="PR Preview" w:date="2024-01-01T00:00:00Z">
         <w:r>
           <w:t xml:space="preserve">.</w:t>
         </w:r>
@@ -18550,12 +18542,12 @@
       <w:pPr>
         <w:pStyle w:val="BodyText"/>
       </w:pPr>
-      <w:ins w:id="120" w:author="PR Preview" w:date="2024-01-01T00:00:00Z">
+      <w:ins w:id="118" w:author="PR Preview" w:date="2024-01-01T00:00:00Z">
         <w:r>
           <w:t xml:space="preserve">Either</w:t>
         </w:r>
       </w:ins>
-      <w:ins w:id="120" w:author="PR Preview" w:date="2024-01-01T00:00:00Z">
+      <w:ins w:id="118" w:author="PR Preview" w:date="2024-01-01T00:00:00Z">
         <w:r>
           <w:t xml:space="preserve"> </w:t>
         </w:r>
@@ -18577,17 +18569,17 @@
           </m:sup>
         </m:sSup>
       </m:oMath>
-      <w:ins w:id="120" w:author="PR Preview" w:date="2024-01-01T00:00:00Z">
+      <w:ins w:id="118" w:author="PR Preview" w:date="2024-01-01T00:00:00Z">
         <w:r>
           <w:t xml:space="preserve"> </w:t>
         </w:r>
       </w:ins>
-      <w:ins w:id="120" w:author="PR Preview" w:date="2024-01-01T00:00:00Z">
+      <w:ins w:id="118" w:author="PR Preview" w:date="2024-01-01T00:00:00Z">
         <w:r>
           <w:t xml:space="preserve">or</w:t>
         </w:r>
       </w:ins>
-      <w:ins w:id="120" w:author="PR Preview" w:date="2024-01-01T00:00:00Z">
+      <w:ins w:id="118" w:author="PR Preview" w:date="2024-01-01T00:00:00Z">
         <w:r>
           <w:t xml:space="preserve"> </w:t>
         </w:r>
@@ -18624,12 +18616,12 @@
           <m:t>)</m:t>
         </m:r>
       </m:oMath>
-      <w:ins w:id="120" w:author="PR Preview" w:date="2024-01-01T00:00:00Z">
+      <w:ins w:id="118" w:author="PR Preview" w:date="2024-01-01T00:00:00Z">
         <w:r>
           <w:t xml:space="preserve"> </w:t>
         </w:r>
       </w:ins>
-      <w:ins w:id="120" w:author="PR Preview" w:date="2024-01-01T00:00:00Z">
+      <w:ins w:id="118" w:author="PR Preview" w:date="2024-01-01T00:00:00Z">
         <w:r>
           <w:t xml:space="preserve">(</w:t>
         </w:r>
@@ -18642,7 +18634,7 @@
           <w:t xml:space="preserve">Definition 9</w:t>
         </w:r>
       </w:hyperlink>
-      <w:ins w:id="120" w:author="PR Preview" w:date="2024-01-01T00:00:00Z">
+      <w:ins w:id="118" w:author="PR Preview" w:date="2024-01-01T00:00:00Z">
         <w:r>
           <w:t xml:space="preserve">) can be used to fit the model.</w:t>
         </w:r>
@@ -19134,7 +19126,7 @@
       <w:pPr>
         <w:pStyle w:val="FirstParagraph"/>
       </w:pPr>
-      <w:ins w:id="126" w:author="PR Preview" w:date="2024-01-01T00:00:00Z">
+      <w:ins w:id="124" w:author="PR Preview" w:date="2024-01-01T00:00:00Z">
         <w:r>
           <w:t xml:space="preserve"> </w:t>
         </w:r>
@@ -19297,16 +19289,6 @@
         </w:tc>
       </w:tr>
     </w:tbl>
-    <w:p>
-      <w:pPr>
-        <w:pStyle w:val="BodyText"/>
-      </w:pPr>
-      <w:ins w:id="127" w:author="PR Preview" w:date="2024-01-01T00:00:00Z">
-        <w:r>
-          <w:t xml:space="preserve"> </w:t>
-        </w:r>
-      </w:ins>
-    </w:p>
     <w:tbl>
       <w:tblPr>
         <w:tblStyle w:val="Table"/>
@@ -19412,6 +19394,9 @@
             <w:pPr>
               <w:pStyle w:val="BodyText"/>
             </w:pPr>
+            <w:pPr>
+              <w:spacing w:before="16"/>
+            </w:pPr>
             <w:r>
               <w:rPr>
                 <w:b/>
@@ -19441,6 +19426,9 @@
           <w:p>
             <w:pPr>
               <w:pStyle w:val="BodyText"/>
+            </w:pPr>
+            <w:pPr>
+              <w:spacing w:after="16"/>
             </w:pPr>
             <w:r>
               <w:rPr>
@@ -19627,7 +19615,7 @@
       <w:pPr>
         <w:pStyle w:val="BodyText"/>
       </w:pPr>
-      <w:ins w:id="131" w:author="PR Preview" w:date="2024-01-01T00:00:00Z">
+      <w:ins w:id="128" w:author="PR Preview" w:date="2024-01-01T00:00:00Z">
         <w:r>
           <w:t xml:space="preserve">The analyses of Sections 12.2-12.4 actually fit</w:t>
         </w:r>
@@ -20179,12 +20167,12 @@
       <w:pPr>
         <w:pStyle w:val="BodyText"/>
       </w:pPr>
-      <w:ins w:id="138" w:author="PR Preview" w:date="2024-01-01T00:00:00Z">
+      <w:ins w:id="135" w:author="PR Preview" w:date="2024-01-01T00:00:00Z">
         <w:r>
           <w:t xml:space="preserve">The superscript</w:t>
         </w:r>
       </w:ins>
-      <w:ins w:id="138" w:author="PR Preview" w:date="2024-01-01T00:00:00Z">
+      <w:ins w:id="135" w:author="PR Preview" w:date="2024-01-01T00:00:00Z">
         <w:r>
           <w:t xml:space="preserve"> </w:t>
         </w:r>
@@ -20203,27 +20191,27 @@
           <m:t>0</m:t>
         </m:r>
       </m:oMath>
-      <w:ins w:id="138" w:author="PR Preview" w:date="2024-01-01T00:00:00Z">
+      <w:ins w:id="135" w:author="PR Preview" w:date="2024-01-01T00:00:00Z">
         <w:r>
           <w:t xml:space="preserve"> </w:t>
         </w:r>
       </w:ins>
-      <w:ins w:id="138" w:author="PR Preview" w:date="2024-01-01T00:00:00Z">
+      <w:ins w:id="135" w:author="PR Preview" w:date="2024-01-01T00:00:00Z">
         <w:r>
           <w:t xml:space="preserve">makes explicit what many investigators mean by</w:t>
         </w:r>
       </w:ins>
-      <w:ins w:id="138" w:author="PR Preview" w:date="2024-01-01T00:00:00Z">
+      <w:ins w:id="135" w:author="PR Preview" w:date="2024-01-01T00:00:00Z">
         <w:r>
           <w:t xml:space="preserve"> </w:t>
         </w:r>
       </w:ins>
-      <w:ins w:id="138" w:author="PR Preview" w:date="2024-01-01T00:00:00Z">
+      <w:ins w:id="135" w:author="PR Preview" w:date="2024-01-01T00:00:00Z">
         <w:r>
           <w:t xml:space="preserve">“the causal effect of</w:t>
         </w:r>
       </w:ins>
-      <w:ins w:id="138" w:author="PR Preview" w:date="2024-01-01T00:00:00Z">
+      <w:ins w:id="135" w:author="PR Preview" w:date="2024-01-01T00:00:00Z">
         <w:r>
           <w:t xml:space="preserve"> </w:t>
         </w:r>
@@ -20233,17 +20221,17 @@
           <m:t>A</m:t>
         </m:r>
       </m:oMath>
-      <w:ins w:id="138" w:author="PR Preview" w:date="2024-01-01T00:00:00Z">
+      <w:ins w:id="135" w:author="PR Preview" w:date="2024-01-01T00:00:00Z">
         <w:r>
           <w:t xml:space="preserve">”</w:t>
         </w:r>
       </w:ins>
-      <w:ins w:id="138" w:author="PR Preview" w:date="2024-01-01T00:00:00Z">
+      <w:ins w:id="135" w:author="PR Preview" w:date="2024-01-01T00:00:00Z">
         <w:r>
           <w:t xml:space="preserve"> </w:t>
         </w:r>
       </w:ins>
-      <w:ins w:id="138" w:author="PR Preview" w:date="2024-01-01T00:00:00Z">
+      <w:ins w:id="135" w:author="PR Preview" w:date="2024-01-01T00:00:00Z">
         <w:r>
           <w:t xml:space="preserve">even when they omit it.</w:t>
         </w:r>
@@ -20774,7 +20762,7 @@
       <w:pPr>
         <w:pStyle w:val="BodyText"/>
       </w:pPr>
-      <w:ins w:id="141" w:author="PR Preview" w:date="2024-01-01T00:00:00Z">
+      <w:ins w:id="138" w:author="PR Preview" w:date="2024-01-01T00:00:00Z">
         <w:r>
           <w:t xml:space="preserve"> </w:t>
         </w:r>
@@ -22235,12 +22223,12 @@
       <w:pPr>
         <w:pStyle w:val="BodyText"/>
       </w:pPr>
-      <w:ins w:id="146" w:author="PR Preview" w:date="2024-01-01T00:00:00Z">
+      <w:ins w:id="143" w:author="PR Preview" w:date="2024-01-01T00:00:00Z">
         <w:r>
           <w:t xml:space="preserve">With either, fit the weighted model</w:t>
         </w:r>
       </w:ins>
-      <w:ins w:id="146" w:author="PR Preview" w:date="2024-01-01T00:00:00Z">
+      <w:ins w:id="143" w:author="PR Preview" w:date="2024-01-01T00:00:00Z">
         <w:r>
           <w:t xml:space="preserve"> </w:t>
         </w:r>
@@ -22333,17 +22321,17 @@
           <m:t>A</m:t>
         </m:r>
       </m:oMath>
-      <w:ins w:id="146" w:author="PR Preview" w:date="2024-01-01T00:00:00Z">
+      <w:ins w:id="143" w:author="PR Preview" w:date="2024-01-01T00:00:00Z">
         <w:r>
           <w:t xml:space="preserve"> </w:t>
         </w:r>
       </w:ins>
-      <w:ins w:id="146" w:author="PR Preview" w:date="2024-01-01T00:00:00Z">
+      <w:ins w:id="143" w:author="PR Preview" w:date="2024-01-01T00:00:00Z">
         <w:r>
           <w:t xml:space="preserve">to estimate the marginal structural model</w:t>
         </w:r>
       </w:ins>
-      <w:ins w:id="146" w:author="PR Preview" w:date="2024-01-01T00:00:00Z">
+      <w:ins w:id="143" w:author="PR Preview" w:date="2024-01-01T00:00:00Z">
         <w:r>
           <w:t xml:space="preserve"> </w:t>
         </w:r>
@@ -22436,22 +22424,22 @@
           <m:t>a</m:t>
         </m:r>
       </m:oMath>
-      <w:ins w:id="146" w:author="PR Preview" w:date="2024-01-01T00:00:00Z">
+      <w:ins w:id="143" w:author="PR Preview" w:date="2024-01-01T00:00:00Z">
         <w:r>
           <w:t xml:space="preserve">;</w:t>
         </w:r>
       </w:ins>
-      <w:ins w:id="146" w:author="PR Preview" w:date="2024-01-01T00:00:00Z">
+      <w:ins w:id="143" w:author="PR Preview" w:date="2024-01-01T00:00:00Z">
         <w:r>
           <w:t xml:space="preserve"> </w:t>
         </w:r>
       </w:ins>
-      <w:ins w:id="146" w:author="PR Preview" w:date="2024-01-01T00:00:00Z">
+      <w:ins w:id="143" w:author="PR Preview" w:date="2024-01-01T00:00:00Z">
         <w:r>
           <w:t xml:space="preserve">the stabilized version uses</w:t>
         </w:r>
       </w:ins>
-      <w:ins w:id="146" w:author="PR Preview" w:date="2024-01-01T00:00:00Z">
+      <w:ins w:id="143" w:author="PR Preview" w:date="2024-01-01T00:00:00Z">
         <w:r>
           <w:t xml:space="preserve"> </w:t>
         </w:r>
@@ -22482,12 +22470,12 @@
           </m:sup>
         </m:sSup>
       </m:oMath>
-      <w:ins w:id="146" w:author="PR Preview" w:date="2024-01-01T00:00:00Z">
+      <w:ins w:id="143" w:author="PR Preview" w:date="2024-01-01T00:00:00Z">
         <w:r>
           <w:t xml:space="preserve"> </w:t>
         </w:r>
       </w:ins>
-      <w:ins w:id="146" w:author="PR Preview" w:date="2024-01-01T00:00:00Z">
+      <w:ins w:id="143" w:author="PR Preview" w:date="2024-01-01T00:00:00Z">
         <w:r>
           <w:t xml:space="preserve">(</w:t>
         </w:r>
@@ -22500,7 +22488,7 @@
           <w:t xml:space="preserve">Definition 15</w:t>
         </w:r>
       </w:hyperlink>
-      <w:ins w:id="146" w:author="PR Preview" w:date="2024-01-01T00:00:00Z">
+      <w:ins w:id="143" w:author="PR Preview" w:date="2024-01-01T00:00:00Z">
         <w:r>
           <w:t xml:space="preserve">).</w:t>
         </w:r>
@@ -23084,6 +23072,9 @@
           <w:p>
             <w:pPr>
               <w:pStyle w:val="BodyText"/>
+            </w:pPr>
+            <w:pPr>
+              <w:spacing w:before="16"/>
             </w:pPr>
             <w:r>
               <w:t xml:space="preserve">The stabilized weights</w:t>
@@ -24397,6 +24388,9 @@
           <w:p>
             <w:pPr>
               <w:pStyle w:val="BodyText"/>
+            </w:pPr>
+            <w:pPr>
+              <w:spacing w:after="16"/>
             </w:pPr>
             <w:r>
               <w:t xml:space="preserve">The Hajek mean is the solution</w:t>

</xml_diff>